<commit_message>
Appointments tests,CI and added requirments file
</commit_message>
<xml_diff>
--- a/Test Results Screenshots.docx
+++ b/Test Results Screenshots.docx
@@ -31,6 +31,9 @@
     </w:p>
     <w:p>
       <w:r>
+        <w:rPr>
+          <w:noProof/>
+        </w:rPr>
         <w:drawing>
           <wp:inline distT="0" distB="0" distL="0" distR="0" wp14:anchorId="737109B7" wp14:editId="2861C5B3">
             <wp:extent cx="5943600" cy="2783840"/>
@@ -117,6 +120,9 @@
     </w:p>
     <w:p>
       <w:r>
+        <w:rPr>
+          <w:noProof/>
+        </w:rPr>
         <w:drawing>
           <wp:inline distT="0" distB="0" distL="0" distR="0" wp14:anchorId="712D37EC" wp14:editId="163760A4">
             <wp:extent cx="5943600" cy="3047365"/>
@@ -180,17 +186,7 @@
           <w:u w:val="single"/>
         </w:rPr>
         <w:lastRenderedPageBreak/>
-        <w:t xml:space="preserve"> </w:t>
-      </w:r>
-      <w:r>
-        <w:rPr>
-          <w:b/>
-          <w:bCs/>
-          <w:sz w:val="28"/>
-          <w:szCs w:val="28"/>
-          <w:u w:val="single"/>
-        </w:rPr>
-        <w:t>PATCH /appointments/{id}/cancel</w:t>
+        <w:t xml:space="preserve"> PATCH /appointments/{id}/cancel</w:t>
       </w:r>
     </w:p>
     <w:p>
@@ -208,6 +204,7 @@
         <w:rPr>
           <w:b/>
           <w:bCs/>
+          <w:noProof/>
           <w:sz w:val="28"/>
           <w:szCs w:val="28"/>
           <w:u w:val="single"/>
@@ -313,6 +310,7 @@
         <w:rPr>
           <w:b/>
           <w:bCs/>
+          <w:noProof/>
           <w:sz w:val="28"/>
           <w:szCs w:val="28"/>
           <w:u w:val="single"/>
@@ -461,6 +459,7 @@
         <w:rPr>
           <w:b/>
           <w:bCs/>
+          <w:noProof/>
           <w:sz w:val="28"/>
           <w:szCs w:val="28"/>
           <w:u w:val="single"/>
@@ -490,6 +489,106 @@
                     <a:xfrm>
                       <a:off x="0" y="0"/>
                       <a:ext cx="5943600" cy="2615565"/>
+                    </a:xfrm>
+                    <a:prstGeom prst="rect">
+                      <a:avLst/>
+                    </a:prstGeom>
+                  </pic:spPr>
+                </pic:pic>
+              </a:graphicData>
+            </a:graphic>
+          </wp:inline>
+        </w:drawing>
+      </w:r>
+    </w:p>
+    <w:p>
+      <w:pPr>
+        <w:ind w:left="360"/>
+        <w:rPr>
+          <w:b/>
+          <w:bCs/>
+          <w:sz w:val="28"/>
+          <w:szCs w:val="28"/>
+          <w:u w:val="single"/>
+        </w:rPr>
+      </w:pPr>
+      <w:r>
+        <w:rPr>
+          <w:b/>
+          <w:bCs/>
+          <w:sz w:val="28"/>
+          <w:szCs w:val="28"/>
+          <w:u w:val="single"/>
+        </w:rPr>
+        <w:t>Bonus</w:t>
+      </w:r>
+    </w:p>
+    <w:p>
+      <w:pPr>
+        <w:ind w:left="360"/>
+        <w:rPr>
+          <w:b/>
+          <w:bCs/>
+          <w:sz w:val="28"/>
+          <w:szCs w:val="28"/>
+          <w:u w:val="single"/>
+        </w:rPr>
+      </w:pPr>
+      <w:r>
+        <w:rPr>
+          <w:b/>
+          <w:bCs/>
+          <w:sz w:val="28"/>
+          <w:szCs w:val="28"/>
+          <w:u w:val="single"/>
+        </w:rPr>
+        <w:t>GET /patients/{id}/appointments</w:t>
+      </w:r>
+    </w:p>
+    <w:p>
+      <w:pPr>
+        <w:ind w:left="360"/>
+        <w:rPr>
+          <w:b/>
+          <w:bCs/>
+          <w:sz w:val="28"/>
+          <w:szCs w:val="28"/>
+          <w:u w:val="single"/>
+        </w:rPr>
+      </w:pPr>
+      <w:r>
+        <w:rPr>
+          <w:b/>
+          <w:bCs/>
+          <w:sz w:val="28"/>
+          <w:szCs w:val="28"/>
+          <w:u w:val="single"/>
+        </w:rPr>
+        <w:drawing>
+          <wp:inline distT="0" distB="0" distL="0" distR="0" wp14:anchorId="43B9784D" wp14:editId="7FCC5631">
+            <wp:extent cx="5943600" cy="3877945"/>
+            <wp:effectExtent l="0" t="0" r="0" b="8255"/>
+            <wp:docPr id="1560580501" name="Picture 1"/>
+            <wp:cNvGraphicFramePr>
+              <a:graphicFrameLocks xmlns:a="http://schemas.openxmlformats.org/drawingml/2006/main" noChangeAspect="1"/>
+            </wp:cNvGraphicFramePr>
+            <a:graphic xmlns:a="http://schemas.openxmlformats.org/drawingml/2006/main">
+              <a:graphicData uri="http://schemas.openxmlformats.org/drawingml/2006/picture">
+                <pic:pic xmlns:pic="http://schemas.openxmlformats.org/drawingml/2006/picture">
+                  <pic:nvPicPr>
+                    <pic:cNvPr id="1560580501" name=""/>
+                    <pic:cNvPicPr/>
+                  </pic:nvPicPr>
+                  <pic:blipFill>
+                    <a:blip r:embed="rId10"/>
+                    <a:stretch>
+                      <a:fillRect/>
+                    </a:stretch>
+                  </pic:blipFill>
+                  <pic:spPr>
+                    <a:xfrm>
+                      <a:off x="0" y="0"/>
+                      <a:ext cx="5943600" cy="3877945"/>
                     </a:xfrm>
                     <a:prstGeom prst="rect">
                       <a:avLst/>

</xml_diff>